<commit_message>
pp-salygos: ketvirtosios patikros taisymai - DPS paketo patikra ir priedų pavadinimai, 1 žingsnio DPS tekstai, juodraštis įsimena įkeltų failų vardus, įkeltos TS numerio ir sutarties priedo pastabos, DI vertimo skaičiai, tiekėjo formos baigtumo patikroje, LT/EN apžiūros datos, 2.15 p. pastaba, juodraščių sąraše būdas ir kalba; šablonų taisymas AD (DPS paraiškos formos eilutės)
Co-Authored-By: Claude Opus 5.5 <noreply@anthropic.com>
</commit_message>
<xml_diff>
--- a/PP-salygos/templates/DPSK_LTEN_PARAISKA.docx
+++ b/PP-salygos/templates/DPSK_LTEN_PARAISKA.docx
@@ -3141,7 +3141,7 @@
                 <w:sz w:val="20"/>
                 <w:szCs w:val="20"/>
               </w:rPr>
-              <w:t xml:space="preserve">(Užpildyti sutikimai būti </w:t>
+              <w:t xml:space="preserve">Užpildyti sutikimai būti </w:t>
             </w:r>
             <w:r>
               <w:rPr>
@@ -3251,7 +3251,7 @@
                 <w:szCs w:val="20"/>
                 <w:lang w:val="en-US"/>
               </w:rPr>
-              <w:t xml:space="preserve">(Completed consents to be a </w:t>
+              <w:t xml:space="preserve">Completed consents to be a </w:t>
             </w:r>
             <w:r>
               <w:rPr>
@@ -3566,7 +3566,7 @@
                 <w:sz w:val="20"/>
                 <w:szCs w:val="20"/>
               </w:rPr>
-              <w:t>6.</w:t>
+              <w:t>5.</w:t>
             </w:r>
           </w:p>
         </w:tc>
@@ -3725,7 +3725,7 @@
                 <w:sz w:val="20"/>
                 <w:szCs w:val="20"/>
               </w:rPr>
-              <w:t>7.</w:t>
+              <w:t>6.</w:t>
             </w:r>
           </w:p>
         </w:tc>

</xml_diff>